<commit_message>
Lectures: descriptive folder/file names + auto-index (match data science site)
</commit_message>
<xml_diff>
--- a/docs/homeworks/hw_10_ancova/10_homework_ancova.docx
+++ b/docs/homeworks/hw_10_ancova/10_homework_ancova.docx
@@ -501,7 +501,7 @@
                     <a:graphicData uri="http://schemas.openxmlformats.org/drawingml/2006/picture">
                       <pic:pic>
                         <pic:nvPicPr>
-                          <pic:cNvPr descr="/Applications/quarto/share/formats/docx/note.png" id="12" name="Picture"/>
+                          <pic:cNvPr descr="/Applications/Positron.app/Contents/Resources/app/quarto/share/formats/docx/note.png" id="12" name="Picture"/>
                           <pic:cNvPicPr>
                             <a:picLocks noChangeArrowheads="1" noChangeAspect="1"/>
                           </pic:cNvPicPr>
@@ -765,7 +765,7 @@
                     <a:graphicData uri="http://schemas.openxmlformats.org/drawingml/2006/picture">
                       <pic:pic>
                         <pic:nvPicPr>
-                          <pic:cNvPr descr="/Applications/quarto/share/formats/docx/important.png" id="19" name="Picture"/>
+                          <pic:cNvPr descr="/Applications/Positron.app/Contents/Resources/app/quarto/share/formats/docx/important.png" id="19" name="Picture"/>
                           <pic:cNvPicPr>
                             <a:picLocks noChangeArrowheads="1" noChangeAspect="1"/>
                           </pic:cNvPicPr>
@@ -1094,7 +1094,7 @@
         <w:rPr>
           <w:rStyle w:val="VerbatimChar"/>
         </w:rPr>
-        <w:t xml:space="preserve">&lt;bytecode: 0x126bb4528&gt;</w:t>
+        <w:t xml:space="preserve">&lt;bytecode: 0xac87f5460&gt;</w:t>
       </w:r>
       <w:r>
         <w:br/>

</xml_diff>